<commit_message>
feat: Backend GFW V3 (Geostore & AOI) - Finalized Data & Docs
</commit_message>
<xml_diff>
--- a/docs/v2_31072026_Laporan_Bab3.docx
+++ b/docs/v2_31072026_Laporan_Bab3.docx
@@ -3754,7 +3754,7 @@
             <w:r>
               <w:drawing>
                 <wp:inline>
-                  <wp:extent cx="5334000" cy="3429000"/>
+                  <wp:extent cx="5334000" cy="3704166"/>
                   <wp:effectExtent b="0" l="0" r="0" t="0"/>
                   <wp:docPr descr="Peta Geospasial 2015" title="" id="46" name="Picture"/>
                   <a:graphic>
@@ -3775,7 +3775,7 @@
                         <pic:spPr bwMode="auto">
                           <a:xfrm>
                             <a:off x="0" y="0"/>
-                            <a:ext cx="5334000" cy="3429000"/>
+                            <a:ext cx="5334000" cy="3704166"/>
                           </a:xfrm>
                           <a:prstGeom prst="rect">
                             <a:avLst/>
@@ -3805,7 +3805,7 @@
             <w:r>
               <w:drawing>
                 <wp:inline>
-                  <wp:extent cx="5334000" cy="3429000"/>
+                  <wp:extent cx="5334000" cy="3704166"/>
                   <wp:effectExtent b="0" l="0" r="0" t="0"/>
                   <wp:docPr descr="Peta Geospasial 2024" title="" id="49" name="Picture"/>
                   <a:graphic>
@@ -3826,7 +3826,7 @@
                         <pic:spPr bwMode="auto">
                           <a:xfrm>
                             <a:off x="0" y="0"/>
-                            <a:ext cx="5334000" cy="3429000"/>
+                            <a:ext cx="5334000" cy="3704166"/>
                           </a:xfrm>
                           <a:prstGeom prst="rect">
                             <a:avLst/>

</xml_diff>